<commit_message>
claude and variable map reference updates post get help + about us changes
</commit_message>
<xml_diff>
--- a/dotCMS Variable Map.docx
+++ b/dotCMS Variable Map.docx
@@ -386,7 +386,7 @@
         <w:gridCol w:w="704"/>
         <w:gridCol w:w="3688"/>
       </w:tblGrid>
-      <w:tr>
+      <w:tr xmlns:wp14="http://schemas.microsoft.com/office/word/2010/wordml" wp14:textId="77777777">
         <w:trPr>
           <w:trHeight w:val="300"/>
         </w:trPr>
@@ -679,7 +679,7 @@
           </w:p>
         </w:tc>
       </w:tr>
-      <w:tr>
+      <w:tr xmlns:wp14="http://schemas.microsoft.com/office/word/2010/wordml" wp14:textId="77777777">
         <w:trPr>
           <w:trHeight w:val="300"/>
         </w:trPr>
@@ -883,7 +883,7 @@
           </w:p>
         </w:tc>
       </w:tr>
-      <w:tr>
+      <w:tr xmlns:wp14="http://schemas.microsoft.com/office/word/2010/wordml" wp14:textId="77777777">
         <w:trPr>
           <w:trHeight w:val="300"/>
         </w:trPr>
@@ -1091,7 +1091,7 @@
           </w:p>
         </w:tc>
       </w:tr>
-      <w:tr>
+      <w:tr xmlns:wp14="http://schemas.microsoft.com/office/word/2010/wordml" wp14:textId="77777777">
         <w:trPr>
           <w:trHeight w:val="300"/>
         </w:trPr>
@@ -1293,7 +1293,7 @@
           </w:p>
         </w:tc>
       </w:tr>
-      <w:tr>
+      <w:tr xmlns:wp14="http://schemas.microsoft.com/office/word/2010/wordml" wp14:textId="77777777">
         <w:trPr>
           <w:trHeight w:val="300"/>
         </w:trPr>
@@ -1501,7 +1501,7 @@
           </w:p>
         </w:tc>
       </w:tr>
-      <w:tr>
+      <w:tr xmlns:wp14="http://schemas.microsoft.com/office/word/2010/wordml" wp14:textId="77777777">
         <w:trPr>
           <w:trHeight w:val="300"/>
         </w:trPr>
@@ -1703,7 +1703,7 @@
           </w:p>
         </w:tc>
       </w:tr>
-      <w:tr>
+      <w:tr xmlns:wp14="http://schemas.microsoft.com/office/word/2010/wordml" wp14:textId="77777777">
         <w:trPr>
           <w:trHeight w:val="300"/>
         </w:trPr>
@@ -1911,7 +1911,7 @@
           </w:p>
         </w:tc>
       </w:tr>
-      <w:tr>
+      <w:tr xmlns:wp14="http://schemas.microsoft.com/office/word/2010/wordml" wp14:textId="77777777">
         <w:trPr>
           <w:trHeight w:val="300"/>
         </w:trPr>
@@ -2130,7 +2130,7 @@
           </w:p>
         </w:tc>
       </w:tr>
-      <w:tr>
+      <w:tr xmlns:wp14="http://schemas.microsoft.com/office/word/2010/wordml" wp14:textId="77777777">
         <w:trPr>
           <w:trHeight w:val="300"/>
         </w:trPr>
@@ -2339,7 +2339,7 @@
           </w:p>
         </w:tc>
       </w:tr>
-      <w:tr>
+      <w:tr xmlns:wp14="http://schemas.microsoft.com/office/word/2010/wordml" wp14:textId="77777777">
         <w:trPr>
           <w:trHeight w:val="300"/>
         </w:trPr>
@@ -2568,7 +2568,7 @@
           </w:p>
         </w:tc>
       </w:tr>
-      <w:tr>
+      <w:tr xmlns:wp14="http://schemas.microsoft.com/office/word/2010/wordml" wp14:textId="77777777">
         <w:trPr>
           <w:trHeight w:val="300"/>
         </w:trPr>
@@ -2801,7 +2801,7 @@
           </w:p>
         </w:tc>
       </w:tr>
-      <w:tr>
+      <w:tr xmlns:wp14="http://schemas.microsoft.com/office/word/2010/wordml" wp14:textId="77777777">
         <w:trPr>
           <w:trHeight w:val="300"/>
         </w:trPr>
@@ -3028,7 +3028,7 @@
           </w:p>
         </w:tc>
       </w:tr>
-      <w:tr>
+      <w:tr xmlns:wp14="http://schemas.microsoft.com/office/word/2010/wordml" wp14:textId="77777777">
         <w:trPr>
           <w:trHeight w:val="300"/>
         </w:trPr>
@@ -3261,7 +3261,7 @@
           </w:p>
         </w:tc>
       </w:tr>
-      <w:tr>
+      <w:tr xmlns:wp14="http://schemas.microsoft.com/office/word/2010/wordml" wp14:textId="77777777">
         <w:trPr>
           <w:trHeight w:val="300"/>
         </w:trPr>
@@ -3488,7 +3488,7 @@
           </w:p>
         </w:tc>
       </w:tr>
-      <w:tr>
+      <w:tr xmlns:wp14="http://schemas.microsoft.com/office/word/2010/wordml" wp14:textId="77777777">
         <w:trPr>
           <w:trHeight w:val="300"/>
         </w:trPr>
@@ -3721,7 +3721,7 @@
           </w:p>
         </w:tc>
       </w:tr>
-      <w:tr>
+      <w:tr xmlns:wp14="http://schemas.microsoft.com/office/word/2010/wordml" wp14:textId="77777777">
         <w:trPr>
           <w:trHeight w:val="300"/>
         </w:trPr>
@@ -3948,7 +3948,7 @@
           </w:p>
         </w:tc>
       </w:tr>
-      <w:tr>
+      <w:tr xmlns:wp14="http://schemas.microsoft.com/office/word/2010/wordml" wp14:textId="77777777">
         <w:trPr>
           <w:trHeight w:val="300"/>
         </w:trPr>
@@ -4181,7 +4181,7 @@
           </w:p>
         </w:tc>
       </w:tr>
-      <w:tr>
+      <w:tr xmlns:wp14="http://schemas.microsoft.com/office/word/2010/wordml" wp14:textId="77777777">
         <w:trPr>
           <w:trHeight w:val="300"/>
         </w:trPr>
@@ -4408,7 +4408,7 @@
           </w:p>
         </w:tc>
       </w:tr>
-      <w:tr>
+      <w:tr xmlns:wp14="http://schemas.microsoft.com/office/word/2010/wordml" wp14:textId="77777777">
         <w:trPr>
           <w:trHeight w:val="300"/>
         </w:trPr>
@@ -4642,7 +4642,7 @@
           </w:p>
         </w:tc>
       </w:tr>
-      <w:tr>
+      <w:tr xmlns:wp14="http://schemas.microsoft.com/office/word/2010/wordml" wp14:textId="77777777">
         <w:trPr>
           <w:trHeight w:val="300"/>
         </w:trPr>
@@ -4846,7 +4846,7 @@
           </w:p>
         </w:tc>
       </w:tr>
-      <w:tr>
+      <w:tr xmlns:wp14="http://schemas.microsoft.com/office/word/2010/wordml" wp14:textId="77777777">
         <w:trPr>
           <w:trHeight w:val="300"/>
         </w:trPr>
@@ -5056,7 +5056,7 @@
           </w:p>
         </w:tc>
       </w:tr>
-      <w:tr>
+      <w:tr xmlns:wp14="http://schemas.microsoft.com/office/word/2010/wordml" wp14:textId="77777777">
         <w:trPr>
           <w:trHeight w:val="300"/>
         </w:trPr>
@@ -5258,7 +5258,7 @@
           </w:p>
         </w:tc>
       </w:tr>
-      <w:tr>
+      <w:tr xmlns:wp14="http://schemas.microsoft.com/office/word/2010/wordml" wp14:textId="77777777">
         <w:trPr>
           <w:trHeight w:val="300"/>
         </w:trPr>
@@ -5466,7 +5466,7 @@
           </w:p>
         </w:tc>
       </w:tr>
-      <w:tr>
+      <w:tr xmlns:wp14="http://schemas.microsoft.com/office/word/2010/wordml" wp14:textId="77777777">
         <w:trPr>
           <w:trHeight w:val="300"/>
         </w:trPr>
@@ -5669,7 +5669,7 @@
           </w:p>
         </w:tc>
       </w:tr>
-      <w:tr>
+      <w:tr xmlns:wp14="http://schemas.microsoft.com/office/word/2010/wordml" wp14:textId="77777777">
         <w:trPr>
           <w:trHeight w:val="300"/>
         </w:trPr>
@@ -5879,7 +5879,7 @@
           </w:p>
         </w:tc>
       </w:tr>
-      <w:tr>
+      <w:tr xmlns:wp14="http://schemas.microsoft.com/office/word/2010/wordml" wp14:textId="77777777">
         <w:trPr>
           <w:trHeight w:val="300"/>
         </w:trPr>
@@ -6131,7 +6131,7 @@
         <w:gridCol w:w="3120"/>
         <w:gridCol w:w="3120"/>
       </w:tblGrid>
-      <w:tr>
+      <w:tr xmlns:wp14="http://schemas.microsoft.com/office/word/2010/wordml" wp14:textId="77777777">
         <w:trPr>
           <w:trHeight w:val="300"/>
         </w:trPr>
@@ -6262,7 +6262,7 @@
           </w:p>
         </w:tc>
       </w:tr>
-      <w:tr>
+      <w:tr xmlns:wp14="http://schemas.microsoft.com/office/word/2010/wordml" wp14:textId="77777777">
         <w:trPr>
           <w:trHeight w:val="300"/>
         </w:trPr>
@@ -6390,7 +6390,7 @@
           </w:p>
         </w:tc>
       </w:tr>
-      <w:tr>
+      <w:tr xmlns:wp14="http://schemas.microsoft.com/office/word/2010/wordml" wp14:textId="77777777">
         <w:trPr>
           <w:trHeight w:val="300"/>
         </w:trPr>
@@ -6518,7 +6518,7 @@
           </w:p>
         </w:tc>
       </w:tr>
-      <w:tr>
+      <w:tr xmlns:wp14="http://schemas.microsoft.com/office/word/2010/wordml" wp14:textId="77777777">
         <w:trPr>
           <w:trHeight w:val="300"/>
         </w:trPr>
@@ -6646,7 +6646,7 @@
           </w:p>
         </w:tc>
       </w:tr>
-      <w:tr>
+      <w:tr xmlns:wp14="http://schemas.microsoft.com/office/word/2010/wordml" wp14:textId="77777777">
         <w:trPr>
           <w:trHeight w:val="300"/>
         </w:trPr>
@@ -6774,7 +6774,7 @@
           </w:p>
         </w:tc>
       </w:tr>
-      <w:tr>
+      <w:tr xmlns:wp14="http://schemas.microsoft.com/office/word/2010/wordml" wp14:textId="77777777">
         <w:trPr>
           <w:trHeight w:val="300"/>
         </w:trPr>
@@ -6902,7 +6902,7 @@
           </w:p>
         </w:tc>
       </w:tr>
-      <w:tr>
+      <w:tr xmlns:wp14="http://schemas.microsoft.com/office/word/2010/wordml" wp14:textId="77777777">
         <w:trPr>
           <w:trHeight w:val="300"/>
         </w:trPr>
@@ -7030,7 +7030,7 @@
           </w:p>
         </w:tc>
       </w:tr>
-      <w:tr>
+      <w:tr xmlns:wp14="http://schemas.microsoft.com/office/word/2010/wordml" wp14:textId="77777777">
         <w:trPr>
           <w:trHeight w:val="300"/>
         </w:trPr>
@@ -7158,7 +7158,7 @@
           </w:p>
         </w:tc>
       </w:tr>
-      <w:tr>
+      <w:tr xmlns:wp14="http://schemas.microsoft.com/office/word/2010/wordml" wp14:textId="77777777">
         <w:trPr>
           <w:trHeight w:val="300"/>
         </w:trPr>
@@ -7286,7 +7286,7 @@
           </w:p>
         </w:tc>
       </w:tr>
-      <w:tr>
+      <w:tr xmlns:wp14="http://schemas.microsoft.com/office/word/2010/wordml" wp14:textId="77777777">
         <w:trPr>
           <w:trHeight w:val="300"/>
         </w:trPr>
@@ -7414,7 +7414,7 @@
           </w:p>
         </w:tc>
       </w:tr>
-      <w:tr>
+      <w:tr xmlns:wp14="http://schemas.microsoft.com/office/word/2010/wordml" wp14:textId="77777777">
         <w:trPr>
           <w:trHeight w:val="300"/>
         </w:trPr>
@@ -7733,7 +7733,7 @@
         <w:gridCol w:w="597"/>
         <w:gridCol w:w="4485"/>
       </w:tblGrid>
-      <w:tr>
+      <w:tr xmlns:wp14="http://schemas.microsoft.com/office/word/2010/wordml" wp14:textId="77777777">
         <w:trPr>
           <w:trHeight w:val="300"/>
         </w:trPr>
@@ -7954,7 +7954,7 @@
           </w:p>
         </w:tc>
       </w:tr>
-      <w:tr>
+      <w:tr xmlns:wp14="http://schemas.microsoft.com/office/word/2010/wordml" wp14:textId="77777777">
         <w:trPr>
           <w:trHeight w:val="300"/>
         </w:trPr>
@@ -8158,7 +8158,7 @@
           </w:p>
         </w:tc>
       </w:tr>
-      <w:tr>
+      <w:tr xmlns:wp14="http://schemas.microsoft.com/office/word/2010/wordml" wp14:textId="77777777">
         <w:trPr>
           <w:trHeight w:val="300"/>
         </w:trPr>
@@ -8366,7 +8366,7 @@
           </w:p>
         </w:tc>
       </w:tr>
-      <w:tr>
+      <w:tr xmlns:wp14="http://schemas.microsoft.com/office/word/2010/wordml" wp14:textId="77777777">
         <w:trPr>
           <w:trHeight w:val="300"/>
         </w:trPr>
@@ -8568,7 +8568,7 @@
           </w:p>
         </w:tc>
       </w:tr>
-      <w:tr>
+      <w:tr xmlns:wp14="http://schemas.microsoft.com/office/word/2010/wordml" wp14:textId="77777777">
         <w:trPr>
           <w:trHeight w:val="300"/>
         </w:trPr>
@@ -8976,7 +8976,7 @@
         <w:gridCol w:w="930"/>
         <w:gridCol w:w="4233"/>
       </w:tblGrid>
-      <w:tr>
+      <w:tr xmlns:wp14="http://schemas.microsoft.com/office/word/2010/wordml" wp14:textId="77777777">
         <w:trPr>
           <w:trHeight w:val="300"/>
         </w:trPr>
@@ -9227,7 +9227,7 @@
           </w:p>
         </w:tc>
       </w:tr>
-      <w:tr>
+      <w:tr xmlns:wp14="http://schemas.microsoft.com/office/word/2010/wordml" wp14:textId="77777777">
         <w:trPr>
           <w:trHeight w:val="300"/>
         </w:trPr>
@@ -9443,7 +9443,7 @@
           </w:p>
         </w:tc>
       </w:tr>
-      <w:tr>
+      <w:tr xmlns:wp14="http://schemas.microsoft.com/office/word/2010/wordml" wp14:textId="77777777">
         <w:trPr>
           <w:trHeight w:val="300"/>
         </w:trPr>
@@ -9464,7 +9464,7 @@
             </w:tcMar>
             <w:vAlign w:val="top"/>
           </w:tcPr>
-          <w:p/>
+          <w:p wp14:textId="77777777"/>
         </w:tc>
         <w:tc>
           <w:tcPr>
@@ -9647,7 +9647,7 @@
           </w:p>
         </w:tc>
       </w:tr>
-      <w:tr>
+      <w:tr xmlns:wp14="http://schemas.microsoft.com/office/word/2010/wordml" wp14:textId="77777777">
         <w:trPr>
           <w:trHeight w:val="300"/>
         </w:trPr>
@@ -9667,7 +9667,7 @@
             </w:tcMar>
             <w:vAlign w:val="top"/>
           </w:tcPr>
-          <w:p/>
+          <w:p wp14:textId="77777777"/>
         </w:tc>
         <w:tc>
           <w:tcPr>
@@ -9845,7 +9845,7 @@
           </w:p>
         </w:tc>
       </w:tr>
-      <w:tr>
+      <w:tr xmlns:wp14="http://schemas.microsoft.com/office/word/2010/wordml" wp14:textId="77777777">
         <w:trPr>
           <w:trHeight w:val="300"/>
         </w:trPr>
@@ -9867,7 +9867,7 @@
             </w:tcMar>
             <w:vAlign w:val="top"/>
           </w:tcPr>
-          <w:p/>
+          <w:p wp14:textId="77777777"/>
         </w:tc>
         <w:tc>
           <w:tcPr>
@@ -10050,7 +10050,7 @@
           </w:p>
         </w:tc>
       </w:tr>
-      <w:tr>
+      <w:tr xmlns:wp14="http://schemas.microsoft.com/office/word/2010/wordml" wp14:textId="77777777">
         <w:trPr>
           <w:trHeight w:val="300"/>
         </w:trPr>
@@ -10265,7 +10265,7 @@
           </w:p>
         </w:tc>
       </w:tr>
-      <w:tr>
+      <w:tr xmlns:wp14="http://schemas.microsoft.com/office/word/2010/wordml" wp14:textId="77777777">
         <w:trPr>
           <w:trHeight w:val="300"/>
         </w:trPr>
@@ -10487,7 +10487,7 @@
           </w:p>
         </w:tc>
       </w:tr>
-      <w:tr>
+      <w:tr xmlns:wp14="http://schemas.microsoft.com/office/word/2010/wordml" wp14:textId="77777777">
         <w:trPr>
           <w:trHeight w:val="300"/>
         </w:trPr>
@@ -10508,7 +10508,7 @@
             </w:tcMar>
             <w:vAlign w:val="top"/>
           </w:tcPr>
-          <w:p/>
+          <w:p wp14:textId="77777777"/>
         </w:tc>
         <w:tc>
           <w:tcPr>
@@ -10686,7 +10686,7 @@
           </w:p>
         </w:tc>
       </w:tr>
-      <w:tr>
+      <w:tr xmlns:wp14="http://schemas.microsoft.com/office/word/2010/wordml" wp14:textId="77777777">
         <w:trPr>
           <w:trHeight w:val="300"/>
         </w:trPr>
@@ -10907,7 +10907,7 @@
           </w:p>
         </w:tc>
       </w:tr>
-      <w:tr>
+      <w:tr xmlns:wp14="http://schemas.microsoft.com/office/word/2010/wordml" wp14:textId="77777777">
         <w:trPr>
           <w:trHeight w:val="300"/>
         </w:trPr>
@@ -11123,7 +11123,7 @@
           </w:p>
         </w:tc>
       </w:tr>
-      <w:tr>
+      <w:tr xmlns:wp14="http://schemas.microsoft.com/office/word/2010/wordml" wp14:textId="77777777">
         <w:trPr>
           <w:trHeight w:val="300"/>
         </w:trPr>
@@ -11145,7 +11145,7 @@
             </w:tcMar>
             <w:vAlign w:val="top"/>
           </w:tcPr>
-          <w:p/>
+          <w:p wp14:textId="77777777"/>
         </w:tc>
         <w:tc>
           <w:tcPr>
@@ -11328,12 +11328,12 @@
           </w:p>
         </w:tc>
       </w:tr>
-      <w:tr>
-        <w:tc>
-          <w:tcPr>
-            <w:tcW w:type="dxa" w:w="1149"/>
-          </w:tcPr>
-          <w:p>
+      <w:tr xmlns:wp14="http://schemas.microsoft.com/office/word/2010/wordml" wp14:textId="77777777">
+        <w:tc>
+          <w:tcPr>
+            <w:tcW w:w="1149" w:type="dxa"/>
+          </w:tcPr>
+          <w:p wp14:textId="77777777">
             <w:r>
               <w:t>🏷️ TAGGING &amp; FILTERS</w:t>
             </w:r>
@@ -11341,9 +11341,9 @@
         </w:tc>
         <w:tc>
           <w:tcPr>
-            <w:tcW w:type="dxa" w:w="1674"/>
-          </w:tcPr>
-          <w:p>
+            <w:tcW w:w="1674" w:type="dxa"/>
+          </w:tcPr>
+          <w:p wp14:textId="77777777">
             <w:r>
               <w:t>Topics</w:t>
             </w:r>
@@ -11351,9 +11351,9 @@
         </w:tc>
         <w:tc>
           <w:tcPr>
-            <w:tcW w:type="dxa" w:w="1642"/>
-          </w:tcPr>
-          <w:p>
+            <w:tcW w:w="1642" w:type="dxa"/>
+          </w:tcPr>
+          <w:p wp14:textId="77777777">
             <w:r>
               <w:t>topics</w:t>
             </w:r>
@@ -11361,9 +11361,9 @@
         </w:tc>
         <w:tc>
           <w:tcPr>
-            <w:tcW w:type="dxa" w:w="1143"/>
-          </w:tcPr>
-          <w:p>
+            <w:tcW w:w="1143" w:type="dxa"/>
+          </w:tcPr>
+          <w:p wp14:textId="77777777">
             <w:r>
               <w:t>Category (multi)</w:t>
             </w:r>
@@ -11371,9 +11371,9 @@
         </w:tc>
         <w:tc>
           <w:tcPr>
-            <w:tcW w:type="dxa" w:w="930"/>
-          </w:tcPr>
-          <w:p>
+            <w:tcW w:w="930" w:type="dxa"/>
+          </w:tcPr>
+          <w:p wp14:textId="77777777">
             <w:r>
               <w:t>Yes</w:t>
             </w:r>
@@ -11381,21 +11381,21 @@
         </w:tc>
         <w:tc>
           <w:tcPr>
-            <w:tcW w:type="dxa" w:w="4233"/>
-          </w:tcPr>
-          <w:p>
+            <w:tcW w:w="4233" w:type="dxa"/>
+          </w:tcPr>
+          <w:p wp14:textId="77777777">
             <w:r>
               <w:t>Tree: CTL_Inst. Resource_Topics. Powers the collapsible multi-select topic pill cloud (6 parent category headings) in the listing widget.</w:t>
             </w:r>
           </w:p>
         </w:tc>
       </w:tr>
-      <w:tr>
-        <w:tc>
-          <w:tcPr>
-            <w:tcW w:type="dxa" w:w="1149"/>
-          </w:tcPr>
-          <w:p>
+      <w:tr xmlns:wp14="http://schemas.microsoft.com/office/word/2010/wordml" wp14:textId="77777777">
+        <w:tc>
+          <w:tcPr>
+            <w:tcW w:w="1149" w:type="dxa"/>
+          </w:tcPr>
+          <w:p wp14:textId="77777777">
             <w:r>
               <w:t>🏷️ TAGGING &amp; FILTERS</w:t>
             </w:r>
@@ -11403,9 +11403,9 @@
         </w:tc>
         <w:tc>
           <w:tcPr>
-            <w:tcW w:type="dxa" w:w="1674"/>
-          </w:tcPr>
-          <w:p>
+            <w:tcW w:w="1674" w:type="dxa"/>
+          </w:tcPr>
+          <w:p wp14:textId="77777777">
             <w:r>
               <w:t>Frameworks</w:t>
             </w:r>
@@ -11413,9 +11413,9 @@
         </w:tc>
         <w:tc>
           <w:tcPr>
-            <w:tcW w:type="dxa" w:w="1642"/>
-          </w:tcPr>
-          <w:p>
+            <w:tcW w:w="1642" w:type="dxa"/>
+          </w:tcPr>
+          <w:p wp14:textId="77777777">
             <w:r>
               <w:t>frameworks</w:t>
             </w:r>
@@ -11423,9 +11423,9 @@
         </w:tc>
         <w:tc>
           <w:tcPr>
-            <w:tcW w:type="dxa" w:w="1143"/>
-          </w:tcPr>
-          <w:p>
+            <w:tcW w:w="1143" w:type="dxa"/>
+          </w:tcPr>
+          <w:p wp14:textId="77777777">
             <w:r>
               <w:t>Category (multi)</w:t>
             </w:r>
@@ -11433,9 +11433,9 @@
         </w:tc>
         <w:tc>
           <w:tcPr>
-            <w:tcW w:type="dxa" w:w="930"/>
-          </w:tcPr>
-          <w:p>
+            <w:tcW w:w="930" w:type="dxa"/>
+          </w:tcPr>
+          <w:p wp14:textId="77777777">
             <w:r>
               <w:t>No</w:t>
             </w:r>
@@ -11443,21 +11443,21 @@
         </w:tc>
         <w:tc>
           <w:tcPr>
-            <w:tcW w:type="dxa" w:w="4233"/>
-          </w:tcPr>
-          <w:p>
+            <w:tcW w:w="4233" w:type="dxa"/>
+          </w:tcPr>
+          <w:p wp14:textId="77777777">
             <w:r>
               <w:t>Display-only badges on cards/detail — NOT filterable. Category tree not yet confirmed.</w:t>
             </w:r>
           </w:p>
         </w:tc>
       </w:tr>
-      <w:tr>
-        <w:tc>
-          <w:tcPr>
-            <w:tcW w:type="dxa" w:w="1149"/>
-          </w:tcPr>
-          <w:p>
+      <w:tr xmlns:wp14="http://schemas.microsoft.com/office/word/2010/wordml" wp14:textId="77777777">
+        <w:tc>
+          <w:tcPr>
+            <w:tcW w:w="1149" w:type="dxa"/>
+          </w:tcPr>
+          <w:p wp14:textId="77777777">
             <w:r>
               <w:t>Unconfirmed</w:t>
             </w:r>
@@ -11465,9 +11465,9 @@
         </w:tc>
         <w:tc>
           <w:tcPr>
-            <w:tcW w:type="dxa" w:w="1674"/>
-          </w:tcPr>
-          <w:p>
+            <w:tcW w:w="1674" w:type="dxa"/>
+          </w:tcPr>
+          <w:p wp14:textId="77777777">
             <w:r>
               <w:t>Author</w:t>
             </w:r>
@@ -11475,9 +11475,9 @@
         </w:tc>
         <w:tc>
           <w:tcPr>
-            <w:tcW w:type="dxa" w:w="1642"/>
-          </w:tcPr>
-          <w:p>
+            <w:tcW w:w="1642" w:type="dxa"/>
+          </w:tcPr>
+          <w:p wp14:textId="77777777">
             <w:r>
               <w:t>author</w:t>
             </w:r>
@@ -11485,9 +11485,9 @@
         </w:tc>
         <w:tc>
           <w:tcPr>
-            <w:tcW w:type="dxa" w:w="1143"/>
-          </w:tcPr>
-          <w:p>
+            <w:tcW w:w="1143" w:type="dxa"/>
+          </w:tcPr>
+          <w:p wp14:textId="77777777">
             <w:r>
               <w:t>Text</w:t>
             </w:r>
@@ -11495,9 +11495,9 @@
         </w:tc>
         <w:tc>
           <w:tcPr>
-            <w:tcW w:type="dxa" w:w="930"/>
-          </w:tcPr>
-          <w:p>
+            <w:tcW w:w="930" w:type="dxa"/>
+          </w:tcPr>
+          <w:p wp14:textId="77777777">
             <w:r>
               <w:t>Yes</w:t>
             </w:r>
@@ -11505,21 +11505,21 @@
         </w:tc>
         <w:tc>
           <w:tcPr>
-            <w:tcW w:type="dxa" w:w="4233"/>
-          </w:tcPr>
-          <w:p>
+            <w:tcW w:w="4233" w:type="dxa"/>
+          </w:tcPr>
+          <w:p wp14:textId="77777777">
             <w:r>
               <w:t>Byline shown on the resource. Tab placement not yet confirmed — verify via REST pull.</w:t>
             </w:r>
           </w:p>
         </w:tc>
       </w:tr>
-      <w:tr>
-        <w:tc>
-          <w:tcPr>
-            <w:tcW w:type="dxa" w:w="1149"/>
-          </w:tcPr>
-          <w:p>
+      <w:tr xmlns:wp14="http://schemas.microsoft.com/office/word/2010/wordml" wp14:textId="77777777">
+        <w:tc>
+          <w:tcPr>
+            <w:tcW w:w="1149" w:type="dxa"/>
+          </w:tcPr>
+          <w:p wp14:textId="77777777">
             <w:r>
               <w:t>Unconfirmed</w:t>
             </w:r>
@@ -11527,9 +11527,9 @@
         </w:tc>
         <w:tc>
           <w:tcPr>
-            <w:tcW w:type="dxa" w:w="1674"/>
-          </w:tcPr>
-          <w:p>
+            <w:tcW w:w="1674" w:type="dxa"/>
+          </w:tcPr>
+          <w:p wp14:textId="77777777">
             <w:r>
               <w:t>Reviewed By</w:t>
             </w:r>
@@ -11537,9 +11537,9 @@
         </w:tc>
         <w:tc>
           <w:tcPr>
-            <w:tcW w:type="dxa" w:w="1642"/>
-          </w:tcPr>
-          <w:p>
+            <w:tcW w:w="1642" w:type="dxa"/>
+          </w:tcPr>
+          <w:p wp14:textId="77777777">
             <w:r>
               <w:t>reviewedBy</w:t>
             </w:r>
@@ -11547,9 +11547,9 @@
         </w:tc>
         <w:tc>
           <w:tcPr>
-            <w:tcW w:type="dxa" w:w="1143"/>
-          </w:tcPr>
-          <w:p>
+            <w:tcW w:w="1143" w:type="dxa"/>
+          </w:tcPr>
+          <w:p wp14:textId="77777777">
             <w:r>
               <w:t>Text</w:t>
             </w:r>
@@ -11557,9 +11557,9 @@
         </w:tc>
         <w:tc>
           <w:tcPr>
-            <w:tcW w:type="dxa" w:w="930"/>
-          </w:tcPr>
-          <w:p>
+            <w:tcW w:w="930" w:type="dxa"/>
+          </w:tcPr>
+          <w:p wp14:textId="77777777">
             <w:r>
               <w:t>No</w:t>
             </w:r>
@@ -11567,21 +11567,21 @@
         </w:tc>
         <w:tc>
           <w:tcPr>
-            <w:tcW w:type="dxa" w:w="4233"/>
-          </w:tcPr>
-          <w:p>
+            <w:tcW w:w="4233" w:type="dxa"/>
+          </w:tcPr>
+          <w:p wp14:textId="77777777">
             <w:r>
               <w:t>QC gate: empty =&gt; item is hidden from the listing widget (still reachable via direct URL). Edit-mode banner shows how many items this hides. Tab placement not yet confirmed.</w:t>
             </w:r>
           </w:p>
         </w:tc>
       </w:tr>
-      <w:tr>
-        <w:tc>
-          <w:tcPr>
-            <w:tcW w:type="dxa" w:w="1149"/>
-          </w:tcPr>
-          <w:p>
+      <w:tr xmlns:wp14="http://schemas.microsoft.com/office/word/2010/wordml" wp14:textId="77777777">
+        <w:tc>
+          <w:tcPr>
+            <w:tcW w:w="1149" w:type="dxa"/>
+          </w:tcPr>
+          <w:p wp14:textId="77777777">
             <w:r>
               <w:t>Unconfirmed</w:t>
             </w:r>
@@ -11589,9 +11589,9 @@
         </w:tc>
         <w:tc>
           <w:tcPr>
-            <w:tcW w:type="dxa" w:w="1674"/>
-          </w:tcPr>
-          <w:p>
+            <w:tcW w:w="1674" w:type="dxa"/>
+          </w:tcPr>
+          <w:p wp14:textId="77777777">
             <w:r>
               <w:t>Last Updated</w:t>
             </w:r>
@@ -11599,9 +11599,9 @@
         </w:tc>
         <w:tc>
           <w:tcPr>
-            <w:tcW w:type="dxa" w:w="1642"/>
-          </w:tcPr>
-          <w:p>
+            <w:tcW w:w="1642" w:type="dxa"/>
+          </w:tcPr>
+          <w:p wp14:textId="77777777">
             <w:r>
               <w:t>lastUpdated</w:t>
             </w:r>
@@ -11609,9 +11609,9 @@
         </w:tc>
         <w:tc>
           <w:tcPr>
-            <w:tcW w:type="dxa" w:w="1143"/>
-          </w:tcPr>
-          <w:p>
+            <w:tcW w:w="1143" w:type="dxa"/>
+          </w:tcPr>
+          <w:p wp14:textId="77777777">
             <w:r>
               <w:t>Date</w:t>
             </w:r>
@@ -11619,9 +11619,9 @@
         </w:tc>
         <w:tc>
           <w:tcPr>
-            <w:tcW w:type="dxa" w:w="930"/>
-          </w:tcPr>
-          <w:p>
+            <w:tcW w:w="930" w:type="dxa"/>
+          </w:tcPr>
+          <w:p wp14:textId="77777777">
             <w:r>
               <w:t>Yes</w:t>
             </w:r>
@@ -11629,21 +11629,21 @@
         </w:tc>
         <w:tc>
           <w:tcPr>
-            <w:tcW w:type="dxa" w:w="4233"/>
-          </w:tcPr>
-          <w:p>
+            <w:tcW w:w="4233" w:type="dxa"/>
+          </w:tcPr>
+          <w:p wp14:textId="77777777">
             <w:r>
               <w:t>java.sql.Timestamp — use .getTime() for epoch comparisons, not string comparison. Drives default card sort order (desc). Tab placement not yet confirmed.</w:t>
             </w:r>
           </w:p>
         </w:tc>
       </w:tr>
-      <w:tr>
-        <w:tc>
-          <w:tcPr>
-            <w:tcW w:type="dxa" w:w="1149"/>
-          </w:tcPr>
-          <w:p>
+      <w:tr xmlns:wp14="http://schemas.microsoft.com/office/word/2010/wordml" wp14:textId="77777777">
+        <w:tc>
+          <w:tcPr>
+            <w:tcW w:w="1149" w:type="dxa"/>
+          </w:tcPr>
+          <w:p wp14:textId="77777777">
             <w:r>
               <w:t>Unconfirmed</w:t>
             </w:r>
@@ -11651,9 +11651,9 @@
         </w:tc>
         <w:tc>
           <w:tcPr>
-            <w:tcW w:type="dxa" w:w="1674"/>
-          </w:tcPr>
-          <w:p>
+            <w:tcW w:w="1674" w:type="dxa"/>
+          </w:tcPr>
+          <w:p wp14:textId="77777777">
             <w:r>
               <w:t>Featured</w:t>
             </w:r>
@@ -11661,9 +11661,9 @@
         </w:tc>
         <w:tc>
           <w:tcPr>
-            <w:tcW w:type="dxa" w:w="1642"/>
-          </w:tcPr>
-          <w:p>
+            <w:tcW w:w="1642" w:type="dxa"/>
+          </w:tcPr>
+          <w:p wp14:textId="77777777">
             <w:r>
               <w:t>featured</w:t>
             </w:r>
@@ -11671,9 +11671,9 @@
         </w:tc>
         <w:tc>
           <w:tcPr>
-            <w:tcW w:type="dxa" w:w="1143"/>
-          </w:tcPr>
-          <w:p>
+            <w:tcW w:w="1143" w:type="dxa"/>
+          </w:tcPr>
+          <w:p wp14:textId="77777777">
             <w:r>
               <w:t>Radio</w:t>
             </w:r>
@@ -11681,9 +11681,9 @@
         </w:tc>
         <w:tc>
           <w:tcPr>
-            <w:tcW w:type="dxa" w:w="930"/>
-          </w:tcPr>
-          <w:p>
+            <w:tcW w:w="930" w:type="dxa"/>
+          </w:tcPr>
+          <w:p wp14:textId="77777777">
             <w:r>
               <w:t>No</w:t>
             </w:r>
@@ -11691,21 +11691,21 @@
         </w:tc>
         <w:tc>
           <w:tcPr>
-            <w:tcW w:type="dxa" w:w="4233"/>
-          </w:tcPr>
-          <w:p>
+            <w:tcW w:w="4233" w:type="dxa"/>
+          </w:tcPr>
+          <w:p wp14:textId="77777777">
             <w:r>
               <w:t>Access via .selectValue ("yes"/"no"), NOT .selectedValues — it's a Radio field, not Checkbox. Featured items get a maroon border + star badge, capped at 3, JS-sorted by modDate. Tab placement not yet confirmed.</w:t>
             </w:r>
           </w:p>
         </w:tc>
       </w:tr>
-      <w:tr>
-        <w:tc>
-          <w:tcPr>
-            <w:tcW w:type="dxa" w:w="1149"/>
-          </w:tcPr>
-          <w:p>
+      <w:tr xmlns:wp14="http://schemas.microsoft.com/office/word/2010/wordml" wp14:textId="77777777">
+        <w:tc>
+          <w:tcPr>
+            <w:tcW w:w="1149" w:type="dxa"/>
+          </w:tcPr>
+          <w:p wp14:textId="77777777">
             <w:r>
               <w:t>🔗 Related Content (assumed)</w:t>
             </w:r>
@@ -11713,9 +11713,9 @@
         </w:tc>
         <w:tc>
           <w:tcPr>
-            <w:tcW w:type="dxa" w:w="1674"/>
-          </w:tcPr>
-          <w:p>
+            <w:tcW w:w="1674" w:type="dxa"/>
+          </w:tcPr>
+          <w:p wp14:textId="77777777">
             <w:r>
               <w:t>Related Instructional Resources</w:t>
             </w:r>
@@ -11723,9 +11723,9 @@
         </w:tc>
         <w:tc>
           <w:tcPr>
-            <w:tcW w:type="dxa" w:w="1642"/>
-          </w:tcPr>
-          <w:p>
+            <w:tcW w:w="1642" w:type="dxa"/>
+          </w:tcPr>
+          <w:p wp14:textId="77777777">
             <w:r>
               <w:t>relatedInstructionalResources</w:t>
             </w:r>
@@ -11733,9 +11733,9 @@
         </w:tc>
         <w:tc>
           <w:tcPr>
-            <w:tcW w:type="dxa" w:w="1143"/>
-          </w:tcPr>
-          <w:p>
+            <w:tcW w:w="1143" w:type="dxa"/>
+          </w:tcPr>
+          <w:p wp14:textId="77777777">
             <w:r>
               <w:t>Relationship -&gt; CtlInstructionalResource</w:t>
             </w:r>
@@ -11743,9 +11743,9 @@
         </w:tc>
         <w:tc>
           <w:tcPr>
-            <w:tcW w:type="dxa" w:w="930"/>
-          </w:tcPr>
-          <w:p>
+            <w:tcW w:w="930" w:type="dxa"/>
+          </w:tcPr>
+          <w:p wp14:textId="77777777">
             <w:r>
               <w:t>No</w:t>
             </w:r>
@@ -11753,21 +11753,21 @@
         </w:tc>
         <w:tc>
           <w:tcPr>
-            <w:tcW w:type="dxa" w:w="4233"/>
-          </w:tcPr>
-          <w:p>
+            <w:tcW w:w="4233" w:type="dxa"/>
+          </w:tcPr>
+          <w:p wp14:textId="77777777">
             <w:r>
               <w:t>Self-relationship. Tab name assumed, not yet confirmed via REST pull.</w:t>
             </w:r>
           </w:p>
         </w:tc>
       </w:tr>
-      <w:tr>
-        <w:tc>
-          <w:tcPr>
-            <w:tcW w:type="dxa" w:w="1149"/>
-          </w:tcPr>
-          <w:p>
+      <w:tr xmlns:wp14="http://schemas.microsoft.com/office/word/2010/wordml" wp14:textId="77777777">
+        <w:tc>
+          <w:tcPr>
+            <w:tcW w:w="1149" w:type="dxa"/>
+          </w:tcPr>
+          <w:p wp14:textId="77777777">
             <w:r>
               <w:t>🔗 Related Content (assumed)</w:t>
             </w:r>
@@ -11775,9 +11775,9 @@
         </w:tc>
         <w:tc>
           <w:tcPr>
-            <w:tcW w:type="dxa" w:w="1674"/>
-          </w:tcPr>
-          <w:p>
+            <w:tcW w:w="1674" w:type="dxa"/>
+          </w:tcPr>
+          <w:p wp14:textId="77777777">
             <w:r>
               <w:t>Related Events</w:t>
             </w:r>
@@ -11785,9 +11785,9 @@
         </w:tc>
         <w:tc>
           <w:tcPr>
-            <w:tcW w:type="dxa" w:w="1642"/>
-          </w:tcPr>
-          <w:p>
+            <w:tcW w:w="1642" w:type="dxa"/>
+          </w:tcPr>
+          <w:p wp14:textId="77777777">
             <w:r>
               <w:t>relatedEvents</w:t>
             </w:r>
@@ -11795,9 +11795,9 @@
         </w:tc>
         <w:tc>
           <w:tcPr>
-            <w:tcW w:type="dxa" w:w="1143"/>
-          </w:tcPr>
-          <w:p>
+            <w:tcW w:w="1143" w:type="dxa"/>
+          </w:tcPr>
+          <w:p wp14:textId="77777777">
             <w:r>
               <w:t>Relationship -&gt; CtlActivity</w:t>
             </w:r>
@@ -11805,9 +11805,9 @@
         </w:tc>
         <w:tc>
           <w:tcPr>
-            <w:tcW w:type="dxa" w:w="930"/>
-          </w:tcPr>
-          <w:p>
+            <w:tcW w:w="930" w:type="dxa"/>
+          </w:tcPr>
+          <w:p wp14:textId="77777777">
             <w:r>
               <w:t>No</w:t>
             </w:r>
@@ -11815,21 +11815,21 @@
         </w:tc>
         <w:tc>
           <w:tcPr>
-            <w:tcW w:type="dxa" w:w="4233"/>
-          </w:tcPr>
-          <w:p>
+            <w:tcW w:w="4233" w:type="dxa"/>
+          </w:tcPr>
+          <w:p wp14:textId="77777777">
             <w:r>
               <w:t>Tab name assumed, not yet confirmed via REST pull.</w:t>
             </w:r>
           </w:p>
         </w:tc>
       </w:tr>
-      <w:tr>
-        <w:tc>
-          <w:tcPr>
-            <w:tcW w:type="dxa" w:w="1149"/>
-          </w:tcPr>
-          <w:p>
+      <w:tr xmlns:wp14="http://schemas.microsoft.com/office/word/2010/wordml" wp14:textId="77777777">
+        <w:tc>
+          <w:tcPr>
+            <w:tcW w:w="1149" w:type="dxa"/>
+          </w:tcPr>
+          <w:p wp14:textId="77777777">
             <w:r>
               <w:t>🔗 Related Content (assumed)</w:t>
             </w:r>
@@ -11837,9 +11837,9 @@
         </w:tc>
         <w:tc>
           <w:tcPr>
-            <w:tcW w:type="dxa" w:w="1674"/>
-          </w:tcPr>
-          <w:p>
+            <w:tcW w:w="1674" w:type="dxa"/>
+          </w:tcPr>
+          <w:p wp14:textId="77777777">
             <w:r>
               <w:t>Related Tech Support</w:t>
             </w:r>
@@ -11847,9 +11847,9 @@
         </w:tc>
         <w:tc>
           <w:tcPr>
-            <w:tcW w:type="dxa" w:w="1642"/>
-          </w:tcPr>
-          <w:p>
+            <w:tcW w:w="1642" w:type="dxa"/>
+          </w:tcPr>
+          <w:p wp14:textId="77777777">
             <w:r>
               <w:t>relatedTechSupport</w:t>
             </w:r>
@@ -11857,9 +11857,9 @@
         </w:tc>
         <w:tc>
           <w:tcPr>
-            <w:tcW w:type="dxa" w:w="1143"/>
-          </w:tcPr>
-          <w:p>
+            <w:tcW w:w="1143" w:type="dxa"/>
+          </w:tcPr>
+          <w:p wp14:textId="77777777">
             <w:r>
               <w:t>Relationship -&gt; CtlTechSupport</w:t>
             </w:r>
@@ -11867,9 +11867,9 @@
         </w:tc>
         <w:tc>
           <w:tcPr>
-            <w:tcW w:type="dxa" w:w="930"/>
-          </w:tcPr>
-          <w:p>
+            <w:tcW w:w="930" w:type="dxa"/>
+          </w:tcPr>
+          <w:p wp14:textId="77777777">
             <w:r>
               <w:t>No</w:t>
             </w:r>
@@ -11877,9 +11877,9 @@
         </w:tc>
         <w:tc>
           <w:tcPr>
-            <w:tcW w:type="dxa" w:w="4233"/>
-          </w:tcPr>
-          <w:p>
+            <w:tcW w:w="4233" w:type="dxa"/>
+          </w:tcPr>
+          <w:p wp14:textId="77777777">
             <w:r>
               <w:t>CtlTechSupport content type is planned but NOT YET BUILT (see Known Issues) — this relationship field already exists on CtlInstructionalResource per the REST pull. Do NOT build against a type called CtlTechResource — that name was deprecated in favor of CtlTechSupport.</w:t>
             </w:r>
@@ -12401,12 +12401,12 @@
         <w:t xml:space="preserve"> = true, sorted by deadline.</w:t>
       </w:r>
     </w:p>
-    <w:p>
+    <w:p xmlns:wp14="http://schemas.microsoft.com/office/word/2010/wordml" wp14:textId="77777777">
       <w:r>
         <w:t>⚠️ BUG (confirmed 2026-07-22 via full CtlActivity REST pull): this widget reads $opp.oppSubmissionDeadline and $opp.oppApplicationLink — neither field exists on CtlActivity. The real fields are signupDeadline and registerApplyLink (the same ones CTL_widget_activity-detail already uses correctly). Until fixed, the deadline display and Apply button on this listing page will silently render blank/fallback for every opportunity.</w:t>
       </w:r>
     </w:p>
-    <w:p>
+    <w:p xmlns:wp14="http://schemas.microsoft.com/office/word/2010/wordml" wp14:textId="77777777">
       <w:pPr>
         <w:pStyle w:val="Heading2"/>
       </w:pPr>
@@ -12414,32 +12414,32 @@
         <w:t>CTL_widget_instructional-resources_listing (v8)  —  🚧 IN PROGRESS</w:t>
       </w:r>
     </w:p>
-    <w:p>
+    <w:p xmlns:wp14="http://schemas.microsoft.com/office/word/2010/wordml" wp14:textId="77777777">
       <w:r>
         <w:t>File: ctl-site_instRes-parent.html</w:t>
       </w:r>
     </w:p>
-    <w:p>
+    <w:p xmlns:wp14="http://schemas.microsoft.com/office/word/2010/wordml" wp14:textId="77777777">
       <w:r>
         <w:t>Purpose: Renders the Instructional Resources listing page — radio filters (Format / Modality), a collapsible multi-select Topic pill cloud (6 parent category headings), dynamic cross-section dimming for zero-match options, partial-match fallback ordering, featured-item pinning (maroon border, star badge, capped at 3, JS-sorted by modDate), and a QC gate hiding items with an empty reviewedBy from the listing (still reachable via direct URL).</w:t>
       </w:r>
     </w:p>
-    <w:p>
+    <w:p xmlns:wp14="http://schemas.microsoft.com/office/word/2010/wordml" wp14:textId="77777777">
       <w:r>
         <w:t>Queries / Renders: $dotcontent.pull("+contentType:CtlInstructionalResource +languageId:1 +live:true", 500, "score").</w:t>
       </w:r>
     </w:p>
-    <w:p>
+    <w:p xmlns:wp14="http://schemas.microsoft.com/office/word/2010/wordml" wp14:textId="77777777">
       <w:r>
         <w:t>Root-caused bug (fixed in this version): earlier drafts referenced format/category as $r.format / $r.category, which don't exist on the live schema — the real fields are formatType and topics (both Category fields, accessed by iterating the field and reading .categoryName on each entry, NOT the Checkbox/Radio .selectedValues / .selectValue pattern). Still pending: final live-URL verification of this fix.</w:t>
       </w:r>
     </w:p>
-    <w:p>
+    <w:p xmlns:wp14="http://schemas.microsoft.com/office/word/2010/wordml" wp14:textId="77777777">
       <w:r>
         <w:t>Note: the file ctl-site_instRes-detail (despite its name) currently contains an earlier draft of this same LISTING widget, not a single-item detail page — see Known Issues below.</w:t>
       </w:r>
     </w:p>
-    <w:p>
+    <w:p xmlns:wp14="http://schemas.microsoft.com/office/word/2010/wordml" wp14:textId="77777777">
       <w:pPr>
         <w:pStyle w:val="Heading2"/>
       </w:pPr>
@@ -12447,47 +12447,47 @@
         <w:t>CTL Homepage Widget  —  🔴 BROKEN</w:t>
       </w:r>
     </w:p>
-    <w:p>
+    <w:p xmlns:wp14="http://schemas.microsoft.com/office/word/2010/wordml" wp14:textId="77777777">
       <w:r>
         <w:t>File: ctl-site_home.html</w:t>
       </w:r>
     </w:p>
-    <w:p>
+    <w:p xmlns:wp14="http://schemas.microsoft.com/office/word/2010/wordml" wp14:textId="77777777">
       <w:r>
         <w:t>Purpose: Tile grid linking to all six site sections, an "Upcoming Events &amp; Opportunities" carousel, and a "Featured Resources" block.</w:t>
       </w:r>
     </w:p>
-    <w:p>
+    <w:p xmlns:wp14="http://schemas.microsoft.com/office/word/2010/wordml" wp14:textId="77777777">
       <w:r>
         <w:t>Known bugs (confirmed 2026-07-22):</w:t>
       </w:r>
     </w:p>
-    <w:p>
+    <w:p xmlns:wp14="http://schemas.microsoft.com/office/word/2010/wordml" wp14:textId="77777777">
       <w:r>
         <w:t>• Featured Resources block checks $featuredResources.size(), but the pull two lines earlier stores its result in $featResources — a variable-name typo. This section never shows real data as written.</w:t>
       </w:r>
     </w:p>
-    <w:p>
+    <w:p xmlns:wp14="http://schemas.microsoft.com/office/word/2010/wordml" wp14:textId="77777777">
       <w:r>
         <w:t>• That same block reads $item.resourceUrl and $item.resourceThumbnail, neither of which exists on CtlInstructionalResource — the real fields are urlTitle (build the link from it, as the listing widget does) and thumbnail.</w:t>
       </w:r>
     </w:p>
-    <w:p>
+    <w:p xmlns:wp14="http://schemas.microsoft.com/office/word/2010/wordml" wp14:textId="77777777">
       <w:r>
         <w:t>• The entire carousel's card markup is wrapped in HTML comments, so it currently renders an empty carousel shell with no visible cards.</w:t>
       </w:r>
     </w:p>
-    <w:p>
+    <w:p xmlns:wp14="http://schemas.microsoft.com/office/word/2010/wordml" wp14:textId="77777777">
       <w:r>
         <w:t>• Sorts "upcoming" by $item.activityDate, which does not exist anywhere on CtlActivity (confirmed via full schema pull). Needs to branch per record: eventStartDate for events, signupDeadline (falling back to submissionDeadline) for opportunities.</w:t>
       </w:r>
     </w:p>
-    <w:p>
+    <w:p xmlns:wp14="http://schemas.microsoft.com/office/word/2010/wordml" wp14:textId="77777777">
       <w:r>
         <w:t>• Leftover debug output still present in the markup ("Count of allResources...", "Count of featResources...").</w:t>
       </w:r>
     </w:p>
-    <w:p>
+    <w:p xmlns:wp14="http://schemas.microsoft.com/office/word/2010/wordml" wp14:textId="77777777">
       <w:pPr>
         <w:pStyle w:val="Heading1"/>
       </w:pPr>
@@ -12495,22 +12495,22 @@
         <w:t>Known Issues / Not Yet Built</w:t>
       </w:r>
     </w:p>
-    <w:p>
+    <w:p xmlns:wp14="http://schemas.microsoft.com/office/word/2010/wordml" wp14:textId="77777777">
       <w:r>
         <w:t>• CtlTechSupport content type: planned, not yet built. Do not build against CtlTechResource — that name was deprecated in favor of CtlTechSupport to match an existing live relationship field (see relatedTechSupport above).</w:t>
       </w:r>
     </w:p>
-    <w:p>
+    <w:p xmlns:wp14="http://schemas.microsoft.com/office/word/2010/wordml" wp14:textId="77777777">
       <w:r>
         <w:t>• Orphaned widgets to delete: ctl_widget_detail-router, CTL_widget_event-calendar_detail, CTL_widget_opportunities_detail — all reference the deleted CtlEventItem/CtlOpportunity content types (replaced by unified CtlActivity).</w:t>
       </w:r>
     </w:p>
-    <w:p>
+    <w:p xmlns:wp14="http://schemas.microsoft.com/office/word/2010/wordml" wp14:textId="77777777">
       <w:r>
         <w:t>• ctl-site_instRes-detail is a misnamed / duplicate earlier draft of the Instructional Resources LISTING widget, not an actual single-item detail page. CtlInstructionalResource has no confirmed detail widget yet — pending a decision on whether to build one from scratch (parallel to CTL_widget_activity-detail).</w:t>
       </w:r>
     </w:p>
-    <w:p>
+    <w:p xmlns:wp14="http://schemas.microsoft.com/office/word/2010/wordml" wp14:textId="77777777">
       <w:r>
         <w:t>• CtlAttachment thumbnail letterboxing: current rendering uses .thumbnailUri, which letterboxes non-matching aspect ratios. Needs a crop-based URL pattern instead.</w:t>
       </w:r>
@@ -13419,7 +13419,7 @@
 </file>
 
 <file path=customXml/item1.xml><?xml version="1.0" encoding="utf-8"?>
-<ct:contentTypeSchema xmlns:ct="http://schemas.microsoft.com/office/2006/metadata/contentType" xmlns:ma="http://schemas.microsoft.com/office/2006/metadata/properties/metaAttributes" ct:_="" ma:_="" ma:contentTypeName="Document" ma:contentTypeID="0x010100D72745110D5DAC4A896943DE1E8D68F8" ma:contentTypeVersion="12" ma:contentTypeDescription="Create a new document." ma:contentTypeScope="" ma:versionID="0a693eaaf59e68321b4cb8996123c6c9">
+<ct:contentTypeSchema xmlns:ct="http://schemas.microsoft.com/office/2006/metadata/contentType" xmlns:ma="http://schemas.microsoft.com/office/2006/metadata/properties/metaAttributes" ct:_="" ma:_="" ma:contentTypeName="Document" ma:contentTypeID="0x010100D72745110D5DAC4A896943DE1E8D68F8" ma:contentTypeVersion="16" ma:contentTypeDescription="Create a new document." ma:contentTypeScope="" ma:versionID="6624a9cfd87c97d910d3db2a5393865c">
   <xsd:schema xmlns:xsd="http://www.w3.org/2001/XMLSchema" xmlns:xs="http://www.w3.org/2001/XMLSchema" xmlns:p="http://schemas.microsoft.com/office/2006/metadata/properties" xmlns:ns2="8c4c3af7-85d7-425c-ada8-cca9ea7d05aa" xmlns:ns3="3fee8fdf-d774-457f-8b7f-2de974eef49a" targetNamespace="http://schemas.microsoft.com/office/2006/metadata/properties" ma:root="true" ma:fieldsID="125f63c570ec6f6b31a93131e0224e4b" ns2:_="" ns3:_="">
     <xsd:import namespace="8c4c3af7-85d7-425c-ada8-cca9ea7d05aa"/>
     <xsd:import namespace="3fee8fdf-d774-457f-8b7f-2de974eef49a"/>
@@ -13640,7 +13640,7 @@
 </file>
 
 <file path=customXml/itemProps1.xml><?xml version="1.0" encoding="utf-8"?>
-<ds:datastoreItem xmlns:ds="http://schemas.openxmlformats.org/officeDocument/2006/customXml" ds:itemID="{107B3257-DA51-48B7-837F-6D191E9F77B0}"/>
+<ds:datastoreItem xmlns:ds="http://schemas.openxmlformats.org/officeDocument/2006/customXml" ds:itemID="{6081D415-ABE5-4D94-9B7A-E43C20EE4448}"/>
 </file>
 
 <file path=customXml/itemProps2.xml><?xml version="1.0" encoding="utf-8"?>

</xml_diff>